<commit_message>
feat: enforce contour_map as primary upload parameter with fallback support for file
</commit_message>
<xml_diff>
--- a/PROJECT_REPORT.docx
+++ b/PROJECT_REPORT.docx
@@ -66,7 +66,7 @@
         <w:spacing w:line="276" w:lineRule="auto" w:after="160"/>
       </w:pPr>
       <w:r>
-        <w:t>This report presents the design, mathematical formulation, algorithmic implementation, and production deployment of the Contour-Based Farm Pond Catchment Analysis API. The backend service accepts contour elevation maps in standard KML and compressed KMZ formats, reconstructs a metric Digital Elevation Model (DEM), conducts hydrological surface runoff modeling, identifies optimal farm pond outlet locations based on multi-criteria terrain heuristics, and delineates the upstream contributing watershed boundary as topologically valid WGS84 GeoJSON polygons.</w:t>
+        <w:t>This report presents the design, mathematical formulation, algorithmic implementation, and production deployment of the Contour-Based Farm Pond Catchment Analysis API. The backend service accepts contour elevation maps in standard KML and compressed KMZ formats under variable name 'contour_map', reconstructs a metric Digital Elevation Model (DEM), conducts hydrological surface runoff modeling, identifies optimal farm pond outlet locations based on multi-criteria terrain heuristics, and delineates the upstream contributing watershed boundary as topologically valid WGS84 GeoJSON polygons.</w:t>
       </w:r>
     </w:p>
     <w:tbl>
@@ -266,7 +266,7 @@
               <w:rPr>
                 <w:b/>
               </w:rPr>
-              <w:t>Interactive OpenAPI Documentation</w:t>
+              <w:t>Primary Upload Variable Name</w:t>
             </w:r>
           </w:p>
         </w:tc>
@@ -283,7 +283,7 @@
           </w:tcPr>
           <w:p>
             <w:r>
-              <w:t>http://10.1.75.51:3241/docs</w:t>
+              <w:t>contour_map (fallback: file)</w:t>
             </w:r>
           </w:p>
         </w:tc>
@@ -305,7 +305,7 @@
               <w:rPr>
                 <w:b/>
               </w:rPr>
-              <w:t>Remote Server Repository Path</w:t>
+              <w:t>Interactive OpenAPI Documentation</w:t>
             </w:r>
           </w:p>
         </w:tc>
@@ -322,7 +322,7 @@
           </w:tcPr>
           <w:p>
             <w:r>
-              <w:t>/home/student/pond_panning (10.1.75.51:2241)</w:t>
+              <w:t>http://10.1.75.51:3241/docs</w:t>
             </w:r>
           </w:p>
         </w:tc>
@@ -344,7 +344,7 @@
               <w:rPr>
                 <w:b/>
               </w:rPr>
-              <w:t>Deployment Architecture</w:t>
+              <w:t>Remote Server Repository Path</w:t>
             </w:r>
           </w:p>
         </w:tc>
@@ -361,7 +361,7 @@
           </w:tcPr>
           <w:p>
             <w:r>
-              <w:t>Endless Auto-Restarting Watchdog Daemon (run_daemon.sh)</w:t>
+              <w:t>/home/student/pond_panning (10.1.75.51:2241)</w:t>
             </w:r>
           </w:p>
         </w:tc>
@@ -383,7 +383,7 @@
               <w:rPr>
                 <w:b/>
               </w:rPr>
-              <w:t>Automated Test Suite</w:t>
+              <w:t>Deployment Architecture</w:t>
             </w:r>
           </w:p>
         </w:tc>
@@ -400,7 +400,46 @@
           </w:tcPr>
           <w:p>
             <w:r>
-              <w:t>21 unit, integration, and topographic scenario tests (pytest)</w:t>
+              <w:t>Endless Auto-Restarting Watchdog Daemon (run_daemon.sh)</w:t>
+            </w:r>
+          </w:p>
+        </w:tc>
+      </w:tr>
+      <w:tr>
+        <w:tc>
+          <w:tcPr>
+            <w:tcW w:type="dxa" w:w="3312"/>
+            <w:shd w:fill="FFFFFF"/>
+            <w:tcMar>
+              <w:top w:w="100" w:type="dxa"/>
+              <w:bottom w:w="100" w:type="dxa"/>
+              <w:left w:w="150" w:type="dxa"/>
+              <w:right w:w="150" w:type="dxa"/>
+            </w:tcMar>
+          </w:tcPr>
+          <w:p>
+            <w:r>
+              <w:rPr>
+                <w:b/>
+              </w:rPr>
+              <w:t>Automated Test Suite</w:t>
+            </w:r>
+          </w:p>
+        </w:tc>
+        <w:tc>
+          <w:tcPr>
+            <w:tcW w:type="dxa" w:w="6048"/>
+            <w:shd w:fill="FFFFFF"/>
+            <w:tcMar>
+              <w:top w:w="100" w:type="dxa"/>
+              <w:bottom w:w="100" w:type="dxa"/>
+              <w:left w:w="150" w:type="dxa"/>
+              <w:right w:w="150" w:type="dxa"/>
+            </w:tcMar>
+          </w:tcPr>
+          <w:p>
+            <w:r>
+              <w:t>23 unit, integration, and topographic scenario tests (pytest)</w:t>
             </w:r>
           </w:p>
         </w:tc>
@@ -522,67 +561,13 @@
     </w:p>
     <w:p>
       <w:pPr>
-        <w:spacing w:before="120" w:after="80"/>
-        <w:jc w:val="center"/>
-      </w:pPr>
-      <w:r>
-        <w:drawing>
-          <wp:inline xmlns:a="http://schemas.openxmlformats.org/drawingml/2006/main" xmlns:pic="http://schemas.openxmlformats.org/drawingml/2006/picture">
-            <wp:extent cx="5669280" cy="2291151"/>
-            <wp:docPr id="1" name="Picture 1"/>
-            <wp:cNvGraphicFramePr>
-              <a:graphicFrameLocks noChangeAspect="1"/>
-            </wp:cNvGraphicFramePr>
-            <a:graphic>
-              <a:graphicData uri="http://schemas.openxmlformats.org/drawingml/2006/picture">
-                <pic:pic>
-                  <pic:nvPicPr>
-                    <pic:cNvPr id="0" name="catchment_visualization.png"/>
-                    <pic:cNvPicPr/>
-                  </pic:nvPicPr>
-                  <pic:blipFill>
-                    <a:blip r:embed="rId9"/>
-                    <a:stretch>
-                      <a:fillRect/>
-                    </a:stretch>
-                  </pic:blipFill>
-                  <pic:spPr>
-                    <a:xfrm>
-                      <a:off x="0" y="0"/>
-                      <a:ext cx="5669280" cy="2291151"/>
-                    </a:xfrm>
-                    <a:prstGeom prst="rect"/>
-                  </pic:spPr>
-                </pic:pic>
-              </a:graphicData>
-            </a:graphic>
-          </wp:inline>
-        </w:drawing>
-      </w:r>
-    </w:p>
-    <w:p>
-      <w:pPr>
-        <w:spacing w:after="200"/>
-        <w:jc w:val="center"/>
-      </w:pPr>
-      <w:r>
-        <w:rPr>
-          <w:i/>
-          <w:color w:val="3C3C3C"/>
-          <w:sz w:val="19"/>
-        </w:rPr>
-        <w:t>Figure 1: High-resolution monochrome terrain analysis visualization for contours_1m.kml. (A) Full metric DEM (264 x 326 cells) with selected farm pond outlet. (B) Detailed view of the delineated 44,300 m² (4.43 ha) upstream catchment boundary.</w:t>
-      </w:r>
-    </w:p>
-    <w:p>
-      <w:pPr>
         <w:spacing w:before="160" w:after="40"/>
       </w:pPr>
       <w:r>
         <w:rPr>
           <w:b/>
         </w:rPr>
-        <w:t>Live Execution Command (Port 3241):</w:t>
+        <w:t>Live Execution Command (using required variable name 'contour_map'):</w:t>
       </w:r>
     </w:p>
     <w:p>
@@ -595,7 +580,7 @@
           <w:rFonts w:ascii="Consolas" w:hAnsi="Consolas"/>
           <w:sz w:val="19"/>
         </w:rPr>
-        <w:t>curl -X POST "http://10.1.75.51:3241/analyzeContour" -F "file=@contours_1m.kml" -F "resolution_m=10.0"</w:t>
+        <w:t>curl -X POST "http://10.1.75.51:3241/analyzeContour" -F "contour_map=@contours_1m.kml" -F "resolution_m=10.0"</w:t>
       </w:r>
     </w:p>
     <w:p>
@@ -695,7 +680,7 @@
         <w:pStyle w:val="Heading2"/>
       </w:pPr>
       <w:r>
-        <w:t>4.1 Working API Endpoint</w:t>
+        <w:t>4.1 Working API Endpoint &amp; Parameter Support</w:t>
       </w:r>
     </w:p>
     <w:p>
@@ -703,7 +688,7 @@
         <w:spacing w:line="276" w:lineRule="auto" w:after="160"/>
       </w:pPr>
       <w:r>
-        <w:t>The service is actively deployed and accessible at http://10.1.75.51:3241/analyzeContour. It supports multipart/form-data uploads with streamed disk tempfile buffering, preventing in-memory file duplication. The endpoint features comprehensive request validation, strict Pydantic response schemas, and structured error responses (400 for corrupt files, 422 for unprocessable flat terrain, and 500 for internal errors).</w:t>
+        <w:t>The service is actively deployed and accessible at http://10.1.75.51:3241/analyzeContour. It explicitly accepts contour map uploads under the primary variable name 'contour_map' (as well as 'file' as a backward-compatible fallback). It streams multipart/form-data uploads with disk tempfile buffering to prevent in-memory duplication, featuring strict Pydantic schemas and structured error codes (400 for corrupt/missing files, 422 for flat terrain, and 500 for internal errors).</w:t>
       </w:r>
     </w:p>
     <w:p>
@@ -811,7 +796,11 @@
         <w:br/>
       </w:r>
       <w:r>
-        <w:t xml:space="preserve">   - file (UploadFile, required): .kml or .kmz contour map file.</w:t>
+        <w:t xml:space="preserve">   - contour_map (UploadFile, required): .kml or .kmz contour map file (primary variable name).</w:t>
+        <w:br/>
+      </w:r>
+      <w:r>
+        <w:t xml:space="preserve">   - file (UploadFile, optional fallback): Alternative parameter name for .kml/.kmz contour map.</w:t>
         <w:br/>
       </w:r>
       <w:r>

</xml_diff>